<commit_message>
git ignore some files and updates to manuscript
</commit_message>
<xml_diff>
--- a/Submission files/Manuscript.docx
+++ b/Submission files/Manuscript.docx
@@ -1132,6 +1132,7 @@
         <w:t xml:space="preserve">recent </w:t>
       </w:r>
       <w:proofErr w:type="spellStart"/>
+      <w:proofErr w:type="gramStart"/>
       <w:r>
         <w:rPr>
           <w:rFonts w:ascii="Times New Roman" w:eastAsia="Times New Roman" w:hAnsi="Times New Roman" w:cs="Times New Roman"/>
@@ -1139,6 +1140,7 @@
         <w:t>randomised</w:t>
       </w:r>
       <w:proofErr w:type="spellEnd"/>
+      <w:proofErr w:type="gramEnd"/>
       <w:r>
         <w:rPr>
           <w:rFonts w:ascii="Times New Roman" w:eastAsia="Times New Roman" w:hAnsi="Times New Roman" w:cs="Times New Roman"/>
@@ -1401,7 +1403,14 @@
         <w:rPr>
           <w:rFonts w:ascii="Times New Roman" w:eastAsia="Times New Roman" w:hAnsi="Times New Roman" w:cs="Times New Roman"/>
         </w:rPr>
-        <w:t>, studies were required to include a placebo group, standard care arm, or active comparator; however, single-arm studies were retained for narrative synthesis given the scarcity of evidence in this field,</w:t>
+        <w:t xml:space="preserve">, studies were required to include a placebo group, standard care arm, or active comparator; however, single-arm studies were retained for narrative synthesis given the scarcity of evidence in this </w:t>
+      </w:r>
+      <w:proofErr w:type="gramStart"/>
+      <w:r>
+        <w:rPr>
+          <w:rFonts w:ascii="Times New Roman" w:eastAsia="Times New Roman" w:hAnsi="Times New Roman" w:cs="Times New Roman"/>
+        </w:rPr>
+        <w:t>field,</w:t>
       </w:r>
       <w:r>
         <w:rPr>
@@ -1413,7 +1422,14 @@
         <w:rPr>
           <w:rFonts w:ascii="Times New Roman" w:eastAsia="Times New Roman" w:hAnsi="Times New Roman" w:cs="Times New Roman"/>
         </w:rPr>
-        <w:t xml:space="preserve">and were explicitly excluded from all pooled meta-analyses. </w:t>
+        <w:t>and</w:t>
+      </w:r>
+      <w:proofErr w:type="gramEnd"/>
+      <w:r>
+        <w:rPr>
+          <w:rFonts w:ascii="Times New Roman" w:eastAsia="Times New Roman" w:hAnsi="Times New Roman" w:cs="Times New Roman"/>
+        </w:rPr>
+        <w:t xml:space="preserve"> were explicitly excluded from all pooled meta-analyses. </w:t>
       </w:r>
       <w:r>
         <w:rPr>
@@ -2344,11 +2360,19 @@
         </w:rPr>
         <w:t xml:space="preserve"> </w:t>
       </w:r>
-      <w:r>
-        <w:rPr>
-          <w:rFonts w:ascii="Times New Roman" w:eastAsia="Times New Roman" w:hAnsi="Times New Roman" w:cs="Times New Roman"/>
-        </w:rPr>
-        <w:t>Reviewers performed assessments independently and were blinded to one another's judgments. Disagreements were resolved through discussion and consensus; a pre-defined third-party adjudication protocol was in place for any conflicts that could not be reconciled.</w:t>
+      <w:proofErr w:type="gramStart"/>
+      <w:r>
+        <w:rPr>
+          <w:rFonts w:ascii="Times New Roman" w:eastAsia="Times New Roman" w:hAnsi="Times New Roman" w:cs="Times New Roman"/>
+        </w:rPr>
+        <w:t>Reviewers</w:t>
+      </w:r>
+      <w:proofErr w:type="gramEnd"/>
+      <w:r>
+        <w:rPr>
+          <w:rFonts w:ascii="Times New Roman" w:eastAsia="Times New Roman" w:hAnsi="Times New Roman" w:cs="Times New Roman"/>
+        </w:rPr>
+        <w:t xml:space="preserve"> performed assessments independently and were blinded to one another's judgments. Disagreements were resolved through discussion and consensus; a pre-defined third-party adjudication protocol was in place for any conflicts that could not be reconciled.</w:t>
       </w:r>
     </w:p>
     <w:p>
@@ -2491,7 +2515,21 @@
         <w:rPr>
           <w:rFonts w:asciiTheme="majorBidi" w:eastAsia="Times New Roman" w:hAnsiTheme="majorBidi" w:cstheme="majorBidi"/>
         </w:rPr>
-        <w:t xml:space="preserve">Where studies reported continuous outcome data as medians and interquartile ranges rather than means and standard deviations — as was the case for Adhikari et al. (2025) — data were converted to means and standard deviations prior to meta-analysis using the validated method described by Wan et al. </w:t>
+        <w:t>Where studies reported continuous outcome data as medians and interquartile ranges rather than means and standard deviations — as was the case for Adhikari et al. (</w:t>
+      </w:r>
+      <w:proofErr w:type="gramStart"/>
+      <w:r>
+        <w:rPr>
+          <w:rFonts w:asciiTheme="majorBidi" w:eastAsia="Times New Roman" w:hAnsiTheme="majorBidi" w:cstheme="majorBidi"/>
+        </w:rPr>
+        <w:t>2025) —</w:t>
+      </w:r>
+      <w:proofErr w:type="gramEnd"/>
+      <w:r>
+        <w:rPr>
+          <w:rFonts w:asciiTheme="majorBidi" w:eastAsia="Times New Roman" w:hAnsiTheme="majorBidi" w:cstheme="majorBidi"/>
+        </w:rPr>
+        <w:t xml:space="preserve"> data were converted to means and standard deviations prior to meta-analysis using the validated method described by Wan et al. </w:t>
       </w:r>
       <w:r>
         <w:rPr>
@@ -2750,6 +2788,7 @@
         <w:t xml:space="preserve">The database search retrieved a combined total of 1,128 records across PubMed, Web of Science, Cochrane CENTRAL, and Scopus. Following automated deduplication within Rayyan and subsequent manual verification, 214 duplicate records were removed, leaving 914 unique records for title and abstract screening. Of these, 896 records were excluded at the title and abstract stage as they did not meet the pre-specified eligibility criteria based on population, intervention, or study design. The full texts of 17 records were subsequently retrieved and assessed for eligibility, of which 10 were excluded for the following reasons: three were narrative or systematic review articles, two were unpublished RCT protocols without outcome data, and five did not meet eligibility criteria with respect to population, intervention, or outcomes reported. Seven studies met all inclusion criteria and were incorporated into the systematic review, comprising five </w:t>
       </w:r>
       <w:proofErr w:type="spellStart"/>
+      <w:proofErr w:type="gramStart"/>
       <w:r>
         <w:rPr>
           <w:rFonts w:asciiTheme="majorBidi" w:eastAsia="Times New Roman" w:hAnsiTheme="majorBidi" w:cstheme="majorBidi"/>
@@ -2757,6 +2796,7 @@
         <w:t>randomised</w:t>
       </w:r>
       <w:proofErr w:type="spellEnd"/>
+      <w:proofErr w:type="gramEnd"/>
       <w:r>
         <w:rPr>
           <w:rFonts w:asciiTheme="majorBidi" w:eastAsia="Times New Roman" w:hAnsiTheme="majorBidi" w:cstheme="majorBidi"/>
@@ -2939,7 +2979,23 @@
           <w:rFonts w:asciiTheme="majorBidi" w:eastAsia="Times New Roman" w:hAnsiTheme="majorBidi" w:cstheme="majorBidi"/>
           <w:lang w:val="en-US"/>
         </w:rPr>
-        <w:t xml:space="preserve"> et al. (2025); dapagliflozin 10 mg once daily was used in Adhikari et al. (2025); and canagliflozin 100 mg was used </w:t>
+        <w:t xml:space="preserve"> et al. </w:t>
+      </w:r>
+      <w:proofErr w:type="gramStart"/>
+      <w:r>
+        <w:rPr>
+          <w:rFonts w:asciiTheme="majorBidi" w:eastAsia="Times New Roman" w:hAnsiTheme="majorBidi" w:cstheme="majorBidi"/>
+          <w:lang w:val="en-US"/>
+        </w:rPr>
+        <w:t>(2025</w:t>
+      </w:r>
+      <w:proofErr w:type="gramEnd"/>
+      <w:r>
+        <w:rPr>
+          <w:rFonts w:asciiTheme="majorBidi" w:eastAsia="Times New Roman" w:hAnsiTheme="majorBidi" w:cstheme="majorBidi"/>
+          <w:lang w:val="en-US"/>
+        </w:rPr>
+        <w:t xml:space="preserve">); dapagliflozin 10 mg once daily was used in Adhikari et al. (2025); and canagliflozin 100 mg was used </w:t>
       </w:r>
       <w:r>
         <w:rPr>
@@ -3093,7 +3149,23 @@
           <w:rFonts w:asciiTheme="majorBidi" w:eastAsia="Times New Roman" w:hAnsiTheme="majorBidi" w:cstheme="majorBidi"/>
           <w:lang w:val="en-US"/>
         </w:rPr>
-        <w:t xml:space="preserve"> et al. (2025). Mean BMI was broadly comparable across most studies, ranging from 25.22 ± 1.62 kg/m² to 32.6 ± 4.45 kg/m²; however, a clinically notable imbalance was observed in Ishibashi et al. (2022), where the SGLT2i group had a substantially higher mean BMI compared to the non-treated diabetic group (30.1 ± 0.72 vs 24.8 ± 0.43 kg/m²), representing a potential source of confounding in this observational study given the established relationship between adiposity, nerve compression, and neuropathy severity. Gender distribution was not reported separately by group in El-Haggar et al. (2024) or </w:t>
+        <w:t xml:space="preserve"> et al. (2025). Mean BMI was broadly comparable across most studies, ranging from 25.22 ± 1.62 kg/m² to 32.6 ± 4.45 kg/m²; however, a clinically notable imbalance was observed in Ishibashi et al. (2022), where the SGLT2i group had a substantially higher mean BMI compared to the non-treated diabetic group (30.1 ± 0.72 vs 24.8 ± 0.43 kg/m²), representing a potential source of confounding in this observational study given the established relationship between adiposity, nerve compression, and neuropathy severity. Gender distribution was not reported separately by </w:t>
+      </w:r>
+      <w:proofErr w:type="gramStart"/>
+      <w:r>
+        <w:rPr>
+          <w:rFonts w:asciiTheme="majorBidi" w:eastAsia="Times New Roman" w:hAnsiTheme="majorBidi" w:cstheme="majorBidi"/>
+          <w:lang w:val="en-US"/>
+        </w:rPr>
+        <w:t>group</w:t>
+      </w:r>
+      <w:proofErr w:type="gramEnd"/>
+      <w:r>
+        <w:rPr>
+          <w:rFonts w:asciiTheme="majorBidi" w:eastAsia="Times New Roman" w:hAnsiTheme="majorBidi" w:cstheme="majorBidi"/>
+          <w:lang w:val="en-US"/>
+        </w:rPr>
+        <w:t xml:space="preserve"> in El-Haggar et al. (2024) or </w:t>
       </w:r>
       <w:proofErr w:type="spellStart"/>
       <w:r>
@@ -3728,7 +3800,23 @@
           <w:lang w:val="en-US"/>
         </w:rPr>
         <w:lastRenderedPageBreak/>
-        <w:t>result was driven by the observational cohort rather than the RCT evidence. Sensitivity analysis using left limb data from El-Haggar 2024 in the full three-study pool produced consistent results with the primary random-effects analysis (MD 1.52 µV; 95% CI 0.02 to 3.01; p = 0.03; I² = 71%, p = 0.05), though heterogeneity increased marginally. On the basis of these findings, the evidence for a significant SGLT2i effect on sural nerve sensory amplitude from RCT data alone is currently insufficient to draw conclusions, and this outcome is considered inconclusive pending larger trials.</w:t>
+        <w:t xml:space="preserve">result was driven by the observational cohort rather than the RCT evidence. Sensitivity analysis using left limb data from El-Haggar 2024 in the full three-study pool produced consistent results with the primary random-effects analysis (MD 1.52 µV; 95% CI 0.02 to 3.01; p = 0.03; I² = 71%, p = 0.05), though heterogeneity increased marginally. </w:t>
+      </w:r>
+      <w:proofErr w:type="gramStart"/>
+      <w:r>
+        <w:rPr>
+          <w:rFonts w:asciiTheme="majorBidi" w:eastAsia="Times New Roman" w:hAnsiTheme="majorBidi" w:cstheme="majorBidi"/>
+          <w:lang w:val="en-US"/>
+        </w:rPr>
+        <w:t>On the basis of</w:t>
+      </w:r>
+      <w:proofErr w:type="gramEnd"/>
+      <w:r>
+        <w:rPr>
+          <w:rFonts w:asciiTheme="majorBidi" w:eastAsia="Times New Roman" w:hAnsiTheme="majorBidi" w:cstheme="majorBidi"/>
+          <w:lang w:val="en-US"/>
+        </w:rPr>
+        <w:t xml:space="preserve"> these findings, the evidence for a significant SGLT2i effect on sural nerve sensory amplitude from RCT data alone is currently insufficient to draw conclusions, and this outcome is considered inconclusive pending larger trials.</w:t>
       </w:r>
     </w:p>
     <w:p>
@@ -3893,7 +3981,23 @@
           <w:rFonts w:asciiTheme="majorBidi" w:eastAsia="Times New Roman" w:hAnsiTheme="majorBidi" w:cstheme="majorBidi"/>
           <w:lang w:val="en-US"/>
         </w:rPr>
-        <w:t xml:space="preserve">Peroneal nerve motor amplitude was reported in El-Haggar 2024 and </w:t>
+        <w:t xml:space="preserve">Peroneal nerve motor </w:t>
+      </w:r>
+      <w:proofErr w:type="gramStart"/>
+      <w:r>
+        <w:rPr>
+          <w:rFonts w:asciiTheme="majorBidi" w:eastAsia="Times New Roman" w:hAnsiTheme="majorBidi" w:cstheme="majorBidi"/>
+          <w:lang w:val="en-US"/>
+        </w:rPr>
+        <w:t>amplitude was</w:t>
+      </w:r>
+      <w:proofErr w:type="gramEnd"/>
+      <w:r>
+        <w:rPr>
+          <w:rFonts w:asciiTheme="majorBidi" w:eastAsia="Times New Roman" w:hAnsiTheme="majorBidi" w:cstheme="majorBidi"/>
+          <w:lang w:val="en-US"/>
+        </w:rPr>
+        <w:t xml:space="preserve"> reported in El-Haggar 2024 and </w:t>
       </w:r>
       <w:proofErr w:type="spellStart"/>
       <w:r>
@@ -3970,7 +4074,23 @@
           <w:rFonts w:asciiTheme="majorBidi" w:eastAsia="Times New Roman" w:hAnsiTheme="majorBidi" w:cstheme="majorBidi"/>
           <w:lang w:val="en-US"/>
         </w:rPr>
-        <w:t>Malondialdehyde (MDA), a marker of lipid peroxidation and oxidative stress, was reported in two RCTs: El-Haggar 2024 and Adhikari 2025. Meta-analysis demonstrated no statistically significant between-group difference in MDA levels following SGLT2i therapy compared to control (MD: XXX; 95% CI XXX to XXX; p = XXX; I² = XXX%). Notably, in Adhikari 2025, a significant reduction in MDA was observed in both the dapagliflozin and control groups (both p &lt; 0.001), suggesting that standard diabetic care itself may reduce systemic oxidative stress, potentially attenuating any SGLT2i-specific effect on this marker. These findings do not exclude a biologically meaningful antioxidant effect of SGLT2 inhibition but indicate that between-group differences in MDA are not currently detectable with the available evidence.</w:t>
+        <w:t xml:space="preserve">Malondialdehyde (MDA), a marker of lipid peroxidation and oxidative stress, was reported in two RCTs: El-Haggar 2024 and Adhikari 2025. Meta-analysis demonstrated </w:t>
+      </w:r>
+      <w:proofErr w:type="gramStart"/>
+      <w:r>
+        <w:rPr>
+          <w:rFonts w:asciiTheme="majorBidi" w:eastAsia="Times New Roman" w:hAnsiTheme="majorBidi" w:cstheme="majorBidi"/>
+          <w:lang w:val="en-US"/>
+        </w:rPr>
+        <w:t>no</w:t>
+      </w:r>
+      <w:proofErr w:type="gramEnd"/>
+      <w:r>
+        <w:rPr>
+          <w:rFonts w:asciiTheme="majorBidi" w:eastAsia="Times New Roman" w:hAnsiTheme="majorBidi" w:cstheme="majorBidi"/>
+          <w:lang w:val="en-US"/>
+        </w:rPr>
+        <w:t xml:space="preserve"> statistically significant between-group difference in MDA levels following SGLT2i therapy compared to control (MD: XXX; 95% CI XXX to XXX; p = XXX; I² = XXX%). Notably, in Adhikari 2025, a significant reduction in MDA was observed in both the dapagliflozin and control groups (both p &lt; 0.001), suggesting that standard diabetic care itself may reduce systemic oxidative stress, potentially attenuating any SGLT2i-specific effect on this marker. These findings do not exclude a biologically meaningful antioxidant effect of SGLT2 inhibition but indicate that between-group differences in MDA are not currently detectable with the available evidence.</w:t>
       </w:r>
     </w:p>
     <w:p>
@@ -4052,7 +4172,55 @@
           <w:rFonts w:asciiTheme="majorBidi" w:eastAsia="Times New Roman" w:hAnsiTheme="majorBidi" w:cstheme="majorBidi"/>
           <w:lang w:val="en-US"/>
         </w:rPr>
-        <w:t>Mehta 2021 was a three-arm open-label RCT comparing empagliflozin monotherapy, combined empagliflozin with Vitamin D, and placebo. With regard to SGLT2i monotherapy, no significant improvement was observed in neuropathic pain or sensory outcomes compared to placebo. Statistically significant improvements in neuropathic pain scores — as measured by the DN-4, NPSI, and IPSWICH Touch the Toes Test — were observed exclusively in the combination arm (empagliflozin + Vitamin D), and not in the empagliflozin monotherapy arm. These findings therefore do not provide independent evidence of a neuroprotective effect attributable to SGLT2 inhibition alone. Furthermore, the open-label design introduces a substantial risk of performance and detection bias, particularly for patient-reported outcomes, and the findings from the combination arm should not be attributed to SGLT2i therapy in isolation. This study contributes no quantitative data to the pooled analyses and its findings are considered hypothesis-generating only.</w:t>
+        <w:t xml:space="preserve">Mehta 2021 was a three-arm open-label RCT comparing empagliflozin monotherapy, </w:t>
+      </w:r>
+      <w:proofErr w:type="gramStart"/>
+      <w:r>
+        <w:rPr>
+          <w:rFonts w:asciiTheme="majorBidi" w:eastAsia="Times New Roman" w:hAnsiTheme="majorBidi" w:cstheme="majorBidi"/>
+          <w:lang w:val="en-US"/>
+        </w:rPr>
+        <w:t>combined</w:t>
+      </w:r>
+      <w:proofErr w:type="gramEnd"/>
+      <w:r>
+        <w:rPr>
+          <w:rFonts w:asciiTheme="majorBidi" w:eastAsia="Times New Roman" w:hAnsiTheme="majorBidi" w:cstheme="majorBidi"/>
+          <w:lang w:val="en-US"/>
+        </w:rPr>
+        <w:t xml:space="preserve"> empagliflozin with Vitamin D, and placebo. </w:t>
+      </w:r>
+      <w:proofErr w:type="gramStart"/>
+      <w:r>
+        <w:rPr>
+          <w:rFonts w:asciiTheme="majorBidi" w:eastAsia="Times New Roman" w:hAnsiTheme="majorBidi" w:cstheme="majorBidi"/>
+          <w:lang w:val="en-US"/>
+        </w:rPr>
+        <w:t>With regard to</w:t>
+      </w:r>
+      <w:proofErr w:type="gramEnd"/>
+      <w:r>
+        <w:rPr>
+          <w:rFonts w:asciiTheme="majorBidi" w:eastAsia="Times New Roman" w:hAnsiTheme="majorBidi" w:cstheme="majorBidi"/>
+          <w:lang w:val="en-US"/>
+        </w:rPr>
+        <w:t xml:space="preserve"> SGLT2i monotherapy, no significant improvement was observed in neuropathic pain or sensory outcomes compared to placebo. Statistically significant improvements in neuropathic pain scores — as measured by the DN-4, NPSI, and IPSWICH Touch the Toes Test — were observed exclusively in the combination arm (empagliflozin + Vitamin D), and not in the empagliflozin monotherapy arm. These findings therefore do not provide independent evidence of a neuroprotective effect attributable to SGLT2 inhibition alone. Furthermore, the open-label design introduces a substantial risk of performance and detection bias, particularly for patient-reported outcomes, and the findings from the combination arm should not be attributed to SGLT2i therapy in isolation. This study contributes no quantitative data to the pooled </w:t>
+      </w:r>
+      <w:proofErr w:type="gramStart"/>
+      <w:r>
+        <w:rPr>
+          <w:rFonts w:asciiTheme="majorBidi" w:eastAsia="Times New Roman" w:hAnsiTheme="majorBidi" w:cstheme="majorBidi"/>
+          <w:lang w:val="en-US"/>
+        </w:rPr>
+        <w:t>analyses</w:t>
+      </w:r>
+      <w:proofErr w:type="gramEnd"/>
+      <w:r>
+        <w:rPr>
+          <w:rFonts w:asciiTheme="majorBidi" w:eastAsia="Times New Roman" w:hAnsiTheme="majorBidi" w:cstheme="majorBidi"/>
+          <w:lang w:val="en-US"/>
+        </w:rPr>
+        <w:t xml:space="preserve"> and its findings are considered hypothesis-generating only.</w:t>
       </w:r>
     </w:p>
     <w:p>
@@ -4138,7 +4306,23 @@
           <w:rFonts w:asciiTheme="majorBidi" w:eastAsia="Times New Roman" w:hAnsiTheme="majorBidi" w:cstheme="majorBidi"/>
           <w:lang w:val="en-US"/>
         </w:rPr>
-        <w:t>Beyond the sural nerve conduction data contributed to the sensitivity analysis, Ishibashi 2022 reported several additional outcomes of relevance. Over a three-year follow-up — the longest among included studies — patients receiving SGLT2 inhibitors demonstrated a significantly improved overall neurophysiological Z-score compared to those not receiving SGLT2i therapy, as well as improvements in the Neuropathy Disability Score (NDS) and warm perception threshold (WPT). Sural nerve amplitude was significantly greater in the SGLT2i group both at baseline and at study completion, and sural SNCV declined significantly in the non-SGLT2i diabetic group while remaining preserved in the treated group. Median nerve sensory amplitude also improved significantly in the SGLT2i group. Notably, no significant changes were observed in median motor conduction velocity, vibration perception threshold, current perception threshold, or CVR-R interval. With regard to corneal confocal microscopy, both diabetic groups demonstrated significantly reduced CNFD, CNFL, and branch frequency at both timepoints compared to non-diabetic controls, and CNBD was significantly decreased in both diabetic groups compared to controls, with no significant between-group difference attributable to SGLT2i treatment. The prevalence of neuropathy showed a non-significant decrease in the SGLT2i group (22.5% to 17.5%) and a non-significant increase in the non-SGLT2i group (20.5% to 28.8%). While these findings are directionally supportive of a neuroprotective effect, the observational design limits causal inference.</w:t>
+        <w:t xml:space="preserve">Beyond the sural nerve conduction data contributed to the sensitivity analysis, Ishibashi 2022 reported several additional outcomes of relevance. Over a three-year follow-up — the longest among included studies — patients receiving SGLT2 inhibitors demonstrated a significantly improved overall neurophysiological Z-score compared to those not receiving SGLT2i therapy, as well as improvements in the Neuropathy Disability Score (NDS) and warm perception threshold (WPT). Sural nerve amplitude was significantly greater in the SGLT2i group both at baseline and at study completion, and sural SNCV declined significantly in the non-SGLT2i diabetic group while remaining preserved in the treated group. Median nerve sensory amplitude also improved significantly in the SGLT2i group. Notably, no significant changes were observed in median motor conduction velocity, vibration perception threshold, current perception threshold, or CVR-R interval. </w:t>
+      </w:r>
+      <w:proofErr w:type="gramStart"/>
+      <w:r>
+        <w:rPr>
+          <w:rFonts w:asciiTheme="majorBidi" w:eastAsia="Times New Roman" w:hAnsiTheme="majorBidi" w:cstheme="majorBidi"/>
+          <w:lang w:val="en-US"/>
+        </w:rPr>
+        <w:t>With regard to</w:t>
+      </w:r>
+      <w:proofErr w:type="gramEnd"/>
+      <w:r>
+        <w:rPr>
+          <w:rFonts w:asciiTheme="majorBidi" w:eastAsia="Times New Roman" w:hAnsiTheme="majorBidi" w:cstheme="majorBidi"/>
+          <w:lang w:val="en-US"/>
+        </w:rPr>
+        <w:t xml:space="preserve"> corneal confocal microscopy, both diabetic groups demonstrated significantly reduced CNFD, CNFL, and branch frequency at both timepoints compared to non-diabetic controls, and CNBD was significantly decreased in both diabetic groups compared to controls, with no significant between-group difference attributable to SGLT2i treatment. The prevalence of neuropathy showed a non-significant decrease in the SGLT2i group (22.5% to 17.5%) and a non-significant increase in the non-SGLT2i group (20.5% to 28.8%). While these findings are directionally supportive of a neuroprotective effect, the observational design limits causal inference.</w:t>
       </w:r>
     </w:p>
     <w:p>
@@ -4550,7 +4734,23 @@
           <w:rFonts w:ascii="Times New Roman" w:eastAsia="Times New Roman" w:hAnsi="Times New Roman" w:cs="Times New Roman"/>
           <w:lang w:val="en-US"/>
         </w:rPr>
-        <w:t xml:space="preserve">This systematic review and meta-analysis is among the first to quantitatively </w:t>
+        <w:t xml:space="preserve">This systematic review and meta-analysis </w:t>
+      </w:r>
+      <w:proofErr w:type="gramStart"/>
+      <w:r>
+        <w:rPr>
+          <w:rFonts w:ascii="Times New Roman" w:eastAsia="Times New Roman" w:hAnsi="Times New Roman" w:cs="Times New Roman"/>
+          <w:lang w:val="en-US"/>
+        </w:rPr>
+        <w:t>is</w:t>
+      </w:r>
+      <w:proofErr w:type="gramEnd"/>
+      <w:r>
+        <w:rPr>
+          <w:rFonts w:ascii="Times New Roman" w:eastAsia="Times New Roman" w:hAnsi="Times New Roman" w:cs="Times New Roman"/>
+          <w:lang w:val="en-US"/>
+        </w:rPr>
+        <w:t xml:space="preserve"> among the first to quantitatively </w:t>
       </w:r>
       <w:proofErr w:type="spellStart"/>
       <w:r>
@@ -4655,7 +4855,23 @@
           <w:lang w:val="en-US"/>
         </w:rPr>
         <w:lastRenderedPageBreak/>
-        <w:t xml:space="preserve">Several mechanistic pathways may underlie this finding. SGLT2 inhibitors promote a shift toward ketone body </w:t>
+        <w:t xml:space="preserve">Several mechanistic pathways may </w:t>
+      </w:r>
+      <w:proofErr w:type="gramStart"/>
+      <w:r>
+        <w:rPr>
+          <w:rFonts w:ascii="Times New Roman" w:eastAsia="Times New Roman" w:hAnsi="Times New Roman" w:cs="Times New Roman"/>
+          <w:lang w:val="en-US"/>
+        </w:rPr>
+        <w:t>underlie</w:t>
+      </w:r>
+      <w:proofErr w:type="gramEnd"/>
+      <w:r>
+        <w:rPr>
+          <w:rFonts w:ascii="Times New Roman" w:eastAsia="Times New Roman" w:hAnsi="Times New Roman" w:cs="Times New Roman"/>
+          <w:lang w:val="en-US"/>
+        </w:rPr>
+        <w:t xml:space="preserve"> this finding. SGLT2 inhibitors promote a shift toward ketone body </w:t>
       </w:r>
       <w:proofErr w:type="spellStart"/>
       <w:r>
@@ -4829,7 +5045,23 @@
           <w:rFonts w:ascii="Times New Roman" w:eastAsia="Times New Roman" w:hAnsi="Times New Roman" w:cs="Times New Roman"/>
           <w:lang w:val="en-US"/>
         </w:rPr>
-        <w:t xml:space="preserve">The significant reduction in peroneal nerve motor latency across two RCTs, in the absence of significant changes in peroneal motor velocity or amplitude, presents an interesting electrophysiological pattern. Latency reduction is consistent with faster conduction through the nerve segment tested, and its significance in the context of non-significant velocity findings may reflect greater sensitivity of latency measures to early conduction improvement, or methodological differences in how these parameters were derived across studies. The non-significant peroneal velocity and amplitude results should not be interpreted as evidence of no effect; with only two contributing studies and extreme heterogeneity in the amplitude analysis (I² = 90%), these analyses are both underpowered and unreliable as summary statistics. The near-uninterpretable heterogeneity in peroneal amplitude in particular likely reflects </w:t>
+        <w:t xml:space="preserve">The significant reduction in peroneal nerve motor latency across two RCTs, in the absence of significant changes in peroneal motor velocity or amplitude, presents an interesting electrophysiological pattern. Latency reduction is consistent with faster conduction through the nerve segment tested, and its significance in the context of non-significant velocity findings may reflect greater sensitivity of latency measures to early conduction improvement, or methodological differences in how these parameters were derived across studies. The non-significant peroneal velocity and amplitude results should not be interpreted as evidence of no effect; with only two contributing studies and extreme heterogeneity in the amplitude analysis (I² = 90%), these analyses are both underpowered and unreliable as summary statistics. The near-uninterpretable heterogeneity in peroneal amplitude </w:t>
+      </w:r>
+      <w:proofErr w:type="gramStart"/>
+      <w:r>
+        <w:rPr>
+          <w:rFonts w:ascii="Times New Roman" w:eastAsia="Times New Roman" w:hAnsi="Times New Roman" w:cs="Times New Roman"/>
+          <w:lang w:val="en-US"/>
+        </w:rPr>
+        <w:t>in particular likely</w:t>
+      </w:r>
+      <w:proofErr w:type="gramEnd"/>
+      <w:r>
+        <w:rPr>
+          <w:rFonts w:ascii="Times New Roman" w:eastAsia="Times New Roman" w:hAnsi="Times New Roman" w:cs="Times New Roman"/>
+          <w:lang w:val="en-US"/>
+        </w:rPr>
+        <w:t xml:space="preserve"> reflects </w:t>
       </w:r>
       <w:r>
         <w:rPr>
@@ -5055,7 +5287,23 @@
           <w:rFonts w:ascii="Times New Roman" w:eastAsia="Times New Roman" w:hAnsi="Times New Roman" w:cs="Times New Roman"/>
           <w:lang w:val="en-US"/>
         </w:rPr>
-        <w:t xml:space="preserve"> neuropathy and is increasingly advocated as a sensitive endpoint in PDN trials. The discordance between studies may reflect differences in disease stage, follow-up duration, SGLT2i agent, or baseline CCM values. CCM findings from these two studies cannot be considered as contributing meaningful evidence in either direction and should be designated as exploratory pending dedicated trials with CCM as a pre-specified primary endpoint.</w:t>
+        <w:t xml:space="preserve"> neuropathy and is increasingly advocated as a sensitive endpoint in PDN trials. The discordance between studies may reflect differences in disease stage, follow-up duration, SGLT2i agent, or baseline CCM values. CCM findings from these two studies cannot be considered as contributing meaningful evidence in either direction </w:t>
+      </w:r>
+      <w:proofErr w:type="gramStart"/>
+      <w:r>
+        <w:rPr>
+          <w:rFonts w:ascii="Times New Roman" w:eastAsia="Times New Roman" w:hAnsi="Times New Roman" w:cs="Times New Roman"/>
+          <w:lang w:val="en-US"/>
+        </w:rPr>
+        <w:t>and</w:t>
+      </w:r>
+      <w:proofErr w:type="gramEnd"/>
+      <w:r>
+        <w:rPr>
+          <w:rFonts w:ascii="Times New Roman" w:eastAsia="Times New Roman" w:hAnsi="Times New Roman" w:cs="Times New Roman"/>
+          <w:lang w:val="en-US"/>
+        </w:rPr>
+        <w:t xml:space="preserve"> should be designated as exploratory pending dedicated trials with CCM as a pre-specified primary endpoint.</w:t>
       </w:r>
     </w:p>
     <w:p>
@@ -5273,7 +5521,21 @@
         <w:rPr>
           <w:rFonts w:ascii="Times New Roman" w:eastAsia="Times New Roman" w:hAnsi="Times New Roman" w:cs="Times New Roman"/>
         </w:rPr>
-        <w:t xml:space="preserve"> A Ahmed for assistance with R code which made the meta-analysis possible.</w:t>
+        <w:t xml:space="preserve"> </w:t>
+      </w:r>
+      <w:proofErr w:type="gramStart"/>
+      <w:r>
+        <w:rPr>
+          <w:rFonts w:ascii="Times New Roman" w:eastAsia="Times New Roman" w:hAnsi="Times New Roman" w:cs="Times New Roman"/>
+        </w:rPr>
+        <w:t>A</w:t>
+      </w:r>
+      <w:proofErr w:type="gramEnd"/>
+      <w:r>
+        <w:rPr>
+          <w:rFonts w:ascii="Times New Roman" w:eastAsia="Times New Roman" w:hAnsi="Times New Roman" w:cs="Times New Roman"/>
+        </w:rPr>
+        <w:t xml:space="preserve"> Ahmed for assistance with R code which made the meta-analysis possible.</w:t>
       </w:r>
     </w:p>
     <w:p>
@@ -5295,7 +5557,35 @@
         <w:rPr>
           <w:rFonts w:ascii="Times New Roman" w:eastAsia="Times New Roman" w:hAnsi="Times New Roman" w:cs="Times New Roman"/>
         </w:rPr>
-        <w:t>Availability of data: Data are available upon reasonable request from corresponding author.</w:t>
+        <w:t xml:space="preserve">Availability of data: Data </w:t>
+      </w:r>
+      <w:proofErr w:type="gramStart"/>
+      <w:r>
+        <w:rPr>
+          <w:rFonts w:ascii="Times New Roman" w:eastAsia="Times New Roman" w:hAnsi="Times New Roman" w:cs="Times New Roman"/>
+        </w:rPr>
+        <w:t>are</w:t>
+      </w:r>
+      <w:proofErr w:type="gramEnd"/>
+      <w:r>
+        <w:rPr>
+          <w:rFonts w:ascii="Times New Roman" w:eastAsia="Times New Roman" w:hAnsi="Times New Roman" w:cs="Times New Roman"/>
+        </w:rPr>
+        <w:t xml:space="preserve"> available </w:t>
+      </w:r>
+      <w:proofErr w:type="gramStart"/>
+      <w:r>
+        <w:rPr>
+          <w:rFonts w:ascii="Times New Roman" w:eastAsia="Times New Roman" w:hAnsi="Times New Roman" w:cs="Times New Roman"/>
+        </w:rPr>
+        <w:t>upon</w:t>
+      </w:r>
+      <w:proofErr w:type="gramEnd"/>
+      <w:r>
+        <w:rPr>
+          <w:rFonts w:ascii="Times New Roman" w:eastAsia="Times New Roman" w:hAnsi="Times New Roman" w:cs="Times New Roman"/>
+        </w:rPr>
+        <w:t xml:space="preserve"> reasonable request from corresponding author.</w:t>
       </w:r>
     </w:p>
     <w:p>
@@ -5367,11 +5657,19 @@
         <w:fldChar w:fldCharType="separate"/>
       </w:r>
       <w:r>
-        <w:t xml:space="preserve">[1] </w:t>
+        <w:t>[1</w:t>
+      </w:r>
+      <w:proofErr w:type="gramStart"/>
+      <w:r>
+        <w:t xml:space="preserve">] </w:t>
       </w:r>
       <w:r>
         <w:tab/>
-        <w:t xml:space="preserve">Kurz FT, Jende JM, Salomir R, et al. Diabetic Peripheral Neuropathy: Current Epidemiology, Diagnostic Advances, Biomarkers, and Management Strategies. </w:t>
+        <w:t>Kurz</w:t>
+      </w:r>
+      <w:proofErr w:type="gramEnd"/>
+      <w:r>
+        <w:t xml:space="preserve"> FT, Jende JM, Salomir R, et al. Diabetic Peripheral Neuropathy: Current Epidemiology, Diagnostic Advances, Biomarkers, and Management Strategies. </w:t>
       </w:r>
       <w:r>
         <w:rPr>
@@ -5419,11 +5717,19 @@
         <w:pStyle w:val="Bibliography"/>
       </w:pPr>
       <w:r>
-        <w:t xml:space="preserve">[3] </w:t>
+        <w:t>[3</w:t>
+      </w:r>
+      <w:proofErr w:type="gramStart"/>
+      <w:r>
+        <w:t xml:space="preserve">] </w:t>
       </w:r>
       <w:r>
         <w:tab/>
-        <w:t xml:space="preserve">Fan B, Chopp M, Zhang ZG, et al. Emerging Roles of microRNAs as Biomarkers and Therapeutic Targets for Diabetic Neuropathy. </w:t>
+        <w:t>Fan</w:t>
+      </w:r>
+      <w:proofErr w:type="gramEnd"/>
+      <w:r>
+        <w:t xml:space="preserve"> B, Chopp M, Zhang ZG, et al. Emerging Roles of microRNAs as Biomarkers and Therapeutic Targets for Diabetic Neuropathy. </w:t>
       </w:r>
       <w:r>
         <w:rPr>
@@ -5441,11 +5747,19 @@
         <w:pStyle w:val="Bibliography"/>
       </w:pPr>
       <w:r>
-        <w:t xml:space="preserve">[4] </w:t>
+        <w:t>[4</w:t>
+      </w:r>
+      <w:proofErr w:type="gramStart"/>
+      <w:r>
+        <w:t xml:space="preserve">] </w:t>
       </w:r>
       <w:r>
         <w:tab/>
-        <w:t xml:space="preserve">Gavini CK, Bookout AL, Bonomo R, et al. Liver X Receptors Protect Dorsal Root Ganglia from Obesity-Induced Endoplasmic Reticulum Stress and Mechanical Allodynia. </w:t>
+        <w:t>Gavini</w:t>
+      </w:r>
+      <w:proofErr w:type="gramEnd"/>
+      <w:r>
+        <w:t xml:space="preserve"> CK, Bookout AL, Bonomo R, et al. Liver X Receptors Protect Dorsal Root Ganglia from Obesity-Induced Endoplasmic Reticulum Stress and Mechanical Allodynia. </w:t>
       </w:r>
       <w:r>
         <w:rPr>
@@ -5463,11 +5777,19 @@
         <w:pStyle w:val="Bibliography"/>
       </w:pPr>
       <w:r>
-        <w:t xml:space="preserve">[5] </w:t>
+        <w:t>[5</w:t>
+      </w:r>
+      <w:proofErr w:type="gramStart"/>
+      <w:r>
+        <w:t xml:space="preserve">] </w:t>
       </w:r>
       <w:r>
         <w:tab/>
-        <w:t xml:space="preserve">Cowie MR, Fisher M. SGLT2 inhibitors: mechanisms of cardiovascular benefit beyond </w:t>
+        <w:t>Cowie</w:t>
+      </w:r>
+      <w:proofErr w:type="gramEnd"/>
+      <w:r>
+        <w:t xml:space="preserve"> MR, Fisher M. SGLT2 inhibitors: mechanisms of cardiovascular benefit beyond </w:t>
       </w:r>
       <w:proofErr w:type="spellStart"/>
       <w:r>
@@ -5502,7 +5824,11 @@
         <w:pStyle w:val="Bibliography"/>
       </w:pPr>
       <w:r>
-        <w:t xml:space="preserve">[6] </w:t>
+        <w:t>[6</w:t>
+      </w:r>
+      <w:proofErr w:type="gramStart"/>
+      <w:r>
+        <w:t xml:space="preserve">] </w:t>
       </w:r>
       <w:r>
         <w:tab/>
@@ -5512,6 +5838,7 @@
         <w:t>Lupsa</w:t>
       </w:r>
       <w:proofErr w:type="spellEnd"/>
+      <w:proofErr w:type="gramEnd"/>
       <w:r>
         <w:t xml:space="preserve"> BC, Kibbey RG, </w:t>
       </w:r>
@@ -5541,7 +5868,11 @@
         <w:pStyle w:val="Bibliography"/>
       </w:pPr>
       <w:r>
-        <w:t xml:space="preserve">[7] </w:t>
+        <w:t>[7</w:t>
+      </w:r>
+      <w:proofErr w:type="gramStart"/>
+      <w:r>
+        <w:t xml:space="preserve">] </w:t>
       </w:r>
       <w:r>
         <w:tab/>
@@ -5551,6 +5882,7 @@
         <w:t>Hushmandi</w:t>
       </w:r>
       <w:proofErr w:type="spellEnd"/>
+      <w:proofErr w:type="gramEnd"/>
       <w:r>
         <w:t xml:space="preserve"> K, </w:t>
       </w:r>
@@ -5611,7 +5943,11 @@
         <w:pStyle w:val="Bibliography"/>
       </w:pPr>
       <w:r>
-        <w:t xml:space="preserve">[8] </w:t>
+        <w:t>[8</w:t>
+      </w:r>
+      <w:proofErr w:type="gramStart"/>
+      <w:r>
+        <w:t xml:space="preserve">] </w:t>
       </w:r>
       <w:r>
         <w:tab/>
@@ -5621,6 +5957,7 @@
         <w:t>Patoulias</w:t>
       </w:r>
       <w:proofErr w:type="spellEnd"/>
+      <w:proofErr w:type="gramEnd"/>
       <w:r>
         <w:t xml:space="preserve"> D, </w:t>
       </w:r>
@@ -5696,11 +6033,19 @@
         <w:pStyle w:val="Bibliography"/>
       </w:pPr>
       <w:r>
-        <w:t xml:space="preserve">[10] </w:t>
+        <w:t>[10</w:t>
+      </w:r>
+      <w:proofErr w:type="gramStart"/>
+      <w:r>
+        <w:t xml:space="preserve">] </w:t>
       </w:r>
       <w:r>
         <w:tab/>
-        <w:t xml:space="preserve">Panou T, </w:t>
+        <w:t>Panou</w:t>
+      </w:r>
+      <w:proofErr w:type="gramEnd"/>
+      <w:r>
+        <w:t xml:space="preserve"> T, </w:t>
       </w:r>
       <w:proofErr w:type="spellStart"/>
       <w:r>
@@ -5726,11 +6071,19 @@
         <w:pStyle w:val="Bibliography"/>
       </w:pPr>
       <w:r>
-        <w:t xml:space="preserve">[11] </w:t>
+        <w:t>[11</w:t>
+      </w:r>
+      <w:proofErr w:type="gramStart"/>
+      <w:r>
+        <w:t xml:space="preserve">] </w:t>
       </w:r>
       <w:r>
         <w:tab/>
-        <w:t xml:space="preserve">Higgins JPT, Thomas J, Chandler J, et al. </w:t>
+        <w:t>Higgins</w:t>
+      </w:r>
+      <w:proofErr w:type="gramEnd"/>
+      <w:r>
+        <w:t xml:space="preserve"> JPT, Thomas J, Chandler J, et al. </w:t>
       </w:r>
       <w:r>
         <w:rPr>
@@ -5748,11 +6101,19 @@
         <w:pStyle w:val="Bibliography"/>
       </w:pPr>
       <w:r>
-        <w:t xml:space="preserve">[12] </w:t>
+        <w:t>[12</w:t>
+      </w:r>
+      <w:proofErr w:type="gramStart"/>
+      <w:r>
+        <w:t xml:space="preserve">] </w:t>
       </w:r>
       <w:r>
         <w:tab/>
-        <w:t xml:space="preserve">Page MJ, McKenzie JE, Bossuyt PM, et al. The PRISMA 2020 statement: an updated guideline for reporting systematic reviews. </w:t>
+        <w:t>Page</w:t>
+      </w:r>
+      <w:proofErr w:type="gramEnd"/>
+      <w:r>
+        <w:t xml:space="preserve"> MJ, McKenzie JE, Bossuyt PM, et al. The PRISMA 2020 statement: an updated guideline for reporting systematic reviews. </w:t>
       </w:r>
       <w:r>
         <w:rPr>
@@ -5838,11 +6199,19 @@
         <w:pStyle w:val="Bibliography"/>
       </w:pPr>
       <w:r>
-        <w:t xml:space="preserve">[15] </w:t>
+        <w:t>[15</w:t>
+      </w:r>
+      <w:proofErr w:type="gramStart"/>
+      <w:r>
+        <w:t xml:space="preserve">] </w:t>
       </w:r>
       <w:r>
         <w:tab/>
-        <w:t xml:space="preserve">El-Haggar SM, Hafez YM, El </w:t>
+        <w:t>El</w:t>
+      </w:r>
+      <w:proofErr w:type="gramEnd"/>
+      <w:r>
+        <w:t xml:space="preserve">-Haggar SM, Hafez YM, El </w:t>
       </w:r>
       <w:proofErr w:type="spellStart"/>
       <w:r>
@@ -5900,11 +6269,19 @@
         <w:pStyle w:val="Bibliography"/>
       </w:pPr>
       <w:r>
-        <w:t xml:space="preserve">[17] </w:t>
+        <w:t>[17</w:t>
+      </w:r>
+      <w:proofErr w:type="gramStart"/>
+      <w:r>
+        <w:t xml:space="preserve">] </w:t>
       </w:r>
       <w:r>
         <w:tab/>
-        <w:t xml:space="preserve">Luo D, Wan X, Liu J, et al. Optimally estimating the sample mean from the sample size, median, mid-range, and/or mid-quartile range. </w:t>
+        <w:t>Luo</w:t>
+      </w:r>
+      <w:proofErr w:type="gramEnd"/>
+      <w:r>
+        <w:t xml:space="preserve"> D, Wan X, Liu J, et al. Optimally estimating the sample mean from the sample size, median, mid-range, and/or mid-quartile range. </w:t>
       </w:r>
       <w:r>
         <w:rPr>
@@ -5922,11 +6299,19 @@
         <w:pStyle w:val="Bibliography"/>
       </w:pPr>
       <w:r>
-        <w:t xml:space="preserve">[18] </w:t>
+        <w:t>[18</w:t>
+      </w:r>
+      <w:proofErr w:type="gramStart"/>
+      <w:r>
+        <w:t xml:space="preserve">] </w:t>
       </w:r>
       <w:r>
         <w:tab/>
-        <w:t xml:space="preserve">R Core Team. </w:t>
+        <w:t>R</w:t>
+      </w:r>
+      <w:proofErr w:type="gramEnd"/>
+      <w:r>
+        <w:t xml:space="preserve"> Core Team. </w:t>
       </w:r>
       <w:r>
         <w:rPr>
@@ -5966,7 +6351,11 @@
         <w:pStyle w:val="Bibliography"/>
       </w:pPr>
       <w:r>
-        <w:t xml:space="preserve">[20] </w:t>
+        <w:t>[20</w:t>
+      </w:r>
+      <w:proofErr w:type="gramStart"/>
+      <w:r>
+        <w:t xml:space="preserve">] </w:t>
       </w:r>
       <w:r>
         <w:tab/>
@@ -5976,6 +6365,7 @@
         <w:t>Viechtbauer</w:t>
       </w:r>
       <w:proofErr w:type="spellEnd"/>
+      <w:proofErr w:type="gramEnd"/>
       <w:r>
         <w:t xml:space="preserve"> W. Conducting Meta-Analyses in </w:t>
       </w:r>
@@ -6026,7 +6416,15 @@
       </w:r>
       <w:proofErr w:type="spellEnd"/>
       <w:r>
-        <w:t xml:space="preserve"> ahead of print 2010. DOI: 10.18637/jss.v036.i03.</w:t>
+        <w:t xml:space="preserve"> ahead of print 2010. DOI: 10.18637/</w:t>
+      </w:r>
+      <w:proofErr w:type="gramStart"/>
+      <w:r>
+        <w:t>jss.v036.i</w:t>
+      </w:r>
+      <w:proofErr w:type="gramEnd"/>
+      <w:r>
+        <w:t>03.</w:t>
       </w:r>
     </w:p>
     <w:p>
@@ -6034,7 +6432,11 @@
         <w:pStyle w:val="Bibliography"/>
       </w:pPr>
       <w:r>
-        <w:t xml:space="preserve">[21] </w:t>
+        <w:t>[21</w:t>
+      </w:r>
+      <w:proofErr w:type="gramStart"/>
+      <w:r>
+        <w:t xml:space="preserve">] </w:t>
       </w:r>
       <w:r>
         <w:tab/>
@@ -6044,6 +6446,7 @@
         <w:t>Vafaeinasab</w:t>
       </w:r>
       <w:proofErr w:type="spellEnd"/>
+      <w:proofErr w:type="gramEnd"/>
       <w:r>
         <w:t xml:space="preserve"> M, Mirzaei </w:t>
       </w:r>
@@ -6053,7 +6456,15 @@
       </w:r>
       <w:proofErr w:type="spellEnd"/>
       <w:r>
-        <w:t xml:space="preserve"> F, Khatibi A, et al. The Comparison of the Effect of Adding Empagliflozin to the Medication Regimen on Peripheral Neuropathy in Patients With Type </w:t>
+        <w:t xml:space="preserve"> F, Khatibi A, et al. The Comparison of the Effect of Adding Empagliflozin to the Medication Regimen on Peripheral Neuropathy in Patients </w:t>
+      </w:r>
+      <w:proofErr w:type="gramStart"/>
+      <w:r>
+        <w:t>With</w:t>
+      </w:r>
+      <w:proofErr w:type="gramEnd"/>
+      <w:r>
+        <w:t xml:space="preserve"> Type </w:t>
       </w:r>
       <w:r>
         <w:rPr>
@@ -6097,11 +6508,19 @@
         <w:pStyle w:val="Bibliography"/>
       </w:pPr>
       <w:r>
-        <w:t xml:space="preserve">[22] </w:t>
+        <w:t>[22</w:t>
+      </w:r>
+      <w:proofErr w:type="gramStart"/>
+      <w:r>
+        <w:t xml:space="preserve">] </w:t>
       </w:r>
       <w:r>
         <w:tab/>
-        <w:t xml:space="preserve">Adhikari U, Gad H, Chatterjee D, et al. Dapagliflozin for Small Nerve </w:t>
+        <w:t>Adhikari</w:t>
+      </w:r>
+      <w:proofErr w:type="gramEnd"/>
+      <w:r>
+        <w:t xml:space="preserve"> U, Gad H, Chatterjee D, et al. Dapagliflozin for Small Nerve </w:t>
       </w:r>
       <w:proofErr w:type="spellStart"/>
       <w:r>
@@ -6117,7 +6536,11 @@
       </w:r>
       <w:proofErr w:type="spellEnd"/>
       <w:r>
-        <w:t xml:space="preserve"> Controlled Study ( </w:t>
+        <w:t xml:space="preserve"> Controlled Study </w:t>
+      </w:r>
+      <w:proofErr w:type="gramStart"/>
+      <w:r>
+        <w:t xml:space="preserve">( </w:t>
       </w:r>
       <w:r>
         <w:rPr>
@@ -6125,6 +6548,7 @@
         </w:rPr>
         <w:t>DINE</w:t>
       </w:r>
+      <w:proofErr w:type="gramEnd"/>
       <w:r>
         <w:t xml:space="preserve"> ). </w:t>
       </w:r>
@@ -6176,11 +6600,19 @@
         <w:pStyle w:val="Bibliography"/>
       </w:pPr>
       <w:r>
-        <w:t xml:space="preserve">[23] </w:t>
+        <w:t>[23</w:t>
+      </w:r>
+      <w:proofErr w:type="gramStart"/>
+      <w:r>
+        <w:t xml:space="preserve">] </w:t>
       </w:r>
       <w:r>
         <w:tab/>
-        <w:t xml:space="preserve">Liao J, Kang A, Xia C, et al. The impact of canagliflozin on the risk of neuropathy events: A post-hoc exploratory analysis of the CREDENCE trial. </w:t>
+        <w:t>Liao</w:t>
+      </w:r>
+      <w:proofErr w:type="gramEnd"/>
+      <w:r>
+        <w:t xml:space="preserve"> J, Kang A, Xia C, et al. The impact of canagliflozin on the risk of neuropathy events: A post-hoc exploratory analysis of the CREDENCE trial. </w:t>
       </w:r>
       <w:r>
         <w:rPr>
@@ -6207,11 +6639,27 @@
         <w:pStyle w:val="Bibliography"/>
       </w:pPr>
       <w:r>
-        <w:t xml:space="preserve">[24] </w:t>
+        <w:t>[24</w:t>
+      </w:r>
+      <w:proofErr w:type="gramStart"/>
+      <w:r>
+        <w:t xml:space="preserve">] </w:t>
       </w:r>
       <w:r>
         <w:tab/>
-        <w:t xml:space="preserve">Mehta S, Nain P, Agrawal BK, et al. Effectiveness of Empagliflozin With Vitamin D Supplementation in Peripheral Neuropathy in Type 2 Diabetic Patients. </w:t>
+        <w:t>Mehta</w:t>
+      </w:r>
+      <w:proofErr w:type="gramEnd"/>
+      <w:r>
+        <w:t xml:space="preserve"> S, Nain P, Agrawal BK, et al. Effectiveness of Empagliflozin </w:t>
+      </w:r>
+      <w:proofErr w:type="gramStart"/>
+      <w:r>
+        <w:t>With</w:t>
+      </w:r>
+      <w:proofErr w:type="gramEnd"/>
+      <w:r>
+        <w:t xml:space="preserve"> Vitamin D Supplementation in Peripheral Neuropathy in Type 2 Diabetic Patients. </w:t>
       </w:r>
       <w:r>
         <w:rPr>
@@ -6302,7 +6750,7 @@
         <w:pStyle w:val="Heading1"/>
         <w:spacing w:line="360" w:lineRule="auto"/>
         <w:rPr>
-          <w:rFonts w:ascii="Times New Roman" w:eastAsia="Times New Roman" w:hAnsi="Times New Roman" w:cs="Times New Roman"/>
+          <w:rFonts w:asciiTheme="majorBidi" w:eastAsia="Times New Roman" w:hAnsiTheme="majorBidi" w:cstheme="majorBidi"/>
           <w:sz w:val="22"/>
           <w:szCs w:val="22"/>
         </w:rPr>
@@ -6311,12 +6759,68 @@
       <w:bookmarkEnd w:id="5"/>
       <w:r>
         <w:rPr>
-          <w:rFonts w:ascii="Times New Roman" w:eastAsia="Times New Roman" w:hAnsi="Times New Roman" w:cs="Times New Roman"/>
+          <w:rFonts w:asciiTheme="majorBidi" w:eastAsia="Times New Roman" w:hAnsiTheme="majorBidi" w:cstheme="majorBidi"/>
           <w:sz w:val="22"/>
           <w:szCs w:val="22"/>
         </w:rPr>
         <w:lastRenderedPageBreak/>
-        <w:t xml:space="preserve">Figures </w:t>
+        <w:t>Figure</w:t>
+      </w:r>
+      <w:r>
+        <w:rPr>
+          <w:rFonts w:asciiTheme="majorBidi" w:eastAsia="Times New Roman" w:hAnsiTheme="majorBidi" w:cstheme="majorBidi"/>
+          <w:sz w:val="22"/>
+          <w:szCs w:val="22"/>
+        </w:rPr>
+        <w:t xml:space="preserve"> Legends</w:t>
+      </w:r>
+    </w:p>
+    <w:p>
+      <w:pPr>
+        <w:spacing w:line="480" w:lineRule="auto"/>
+        <w:rPr>
+          <w:rFonts w:asciiTheme="majorBidi" w:hAnsiTheme="majorBidi" w:cstheme="majorBidi"/>
+        </w:rPr>
+      </w:pPr>
+      <w:r>
+        <w:rPr>
+          <w:rFonts w:asciiTheme="majorBidi" w:hAnsiTheme="majorBidi" w:cstheme="majorBidi"/>
+        </w:rPr>
+        <w:t>Figure 1: PRISMA diagram for screening process</w:t>
+      </w:r>
+    </w:p>
+    <w:p>
+      <w:pPr>
+        <w:spacing w:line="480" w:lineRule="auto"/>
+        <w:rPr>
+          <w:rFonts w:asciiTheme="majorBidi" w:hAnsiTheme="majorBidi" w:cstheme="majorBidi"/>
+        </w:rPr>
+      </w:pPr>
+      <w:r>
+        <w:rPr>
+          <w:rFonts w:asciiTheme="majorBidi" w:hAnsiTheme="majorBidi" w:cstheme="majorBidi"/>
+        </w:rPr>
+        <w:t>Figure 2:</w:t>
+      </w:r>
+      <w:r>
+        <w:rPr>
+          <w:rFonts w:asciiTheme="majorBidi" w:hAnsiTheme="majorBidi" w:cstheme="majorBidi"/>
+        </w:rPr>
+        <w:t xml:space="preserve"> RoB-2 for RCTs </w:t>
+      </w:r>
+    </w:p>
+    <w:p>
+      <w:pPr>
+        <w:spacing w:line="480" w:lineRule="auto"/>
+        <w:rPr>
+          <w:rFonts w:asciiTheme="majorBidi" w:hAnsiTheme="majorBidi" w:cstheme="majorBidi"/>
+        </w:rPr>
+      </w:pPr>
+      <w:r>
+        <w:rPr>
+          <w:rFonts w:asciiTheme="majorBidi" w:hAnsiTheme="majorBidi" w:cstheme="majorBidi"/>
+        </w:rPr>
+        <w:t>Figure 3: Forest plot representing meta-analysis for sural nerve conduction velocity</w:t>
       </w:r>
     </w:p>
     <w:p>
@@ -6658,7 +7162,25 @@
                 <w:sz w:val="18"/>
                 <w:szCs w:val="18"/>
               </w:rPr>
-              <w:t>Gender (M:F)</w:t>
+              <w:t>Gender (</w:t>
+            </w:r>
+            <w:proofErr w:type="gramStart"/>
+            <w:r>
+              <w:rPr>
+                <w:rFonts w:asciiTheme="majorBidi" w:eastAsia="Lexend" w:hAnsiTheme="majorBidi" w:cstheme="majorBidi"/>
+                <w:sz w:val="18"/>
+                <w:szCs w:val="18"/>
+              </w:rPr>
+              <w:t>M:F</w:t>
+            </w:r>
+            <w:proofErr w:type="gramEnd"/>
+            <w:r>
+              <w:rPr>
+                <w:rFonts w:asciiTheme="majorBidi" w:eastAsia="Lexend" w:hAnsiTheme="majorBidi" w:cstheme="majorBidi"/>
+                <w:sz w:val="18"/>
+                <w:szCs w:val="18"/>
+              </w:rPr>
+              <w:t>)</w:t>
             </w:r>
           </w:p>
         </w:tc>
@@ -10584,6 +11106,7 @@
                 <w:szCs w:val="18"/>
               </w:rPr>
             </w:pPr>
+            <w:proofErr w:type="gramStart"/>
             <w:r>
               <w:rPr>
                 <w:rFonts w:asciiTheme="majorBidi" w:eastAsia="Lexend" w:hAnsiTheme="majorBidi" w:cstheme="majorBidi"/>
@@ -10592,6 +11115,7 @@
               </w:rPr>
               <w:t>Single-arm</w:t>
             </w:r>
+            <w:proofErr w:type="gramEnd"/>
           </w:p>
         </w:tc>
         <w:tc>

</xml_diff>